<commit_message>
fix(dbms): audit and repair normalization migration, prevent data loss, ensure application compatibility, and generate documentation
</commit_message>
<xml_diff>
--- a/BANKIST_NORMALIZATION_DOCUMENTATION.docx
+++ b/BANKIST_NORMALIZATION_DOCUMENTATION.docx
@@ -2674,7 +2674,7 @@
         <w:br/>
         <w:t>Audit &amp; Resolution:</w:t>
         <w:br/>
-        <w:t>• In all core entities ('customers', 'accounts', 'transactions', 'deposits', 'branches', 'cards'), the primary keys are single attributes (e.g., 'customer_id', 'account_number', 'branch_id'). Therefore, no proper subset exists, precluding any partial key dependency.</w:t>
+        <w:t>• In all core entities ('customers', 'accounts', 'transactions', 'deposits', 'branches', 'account_card_credentials'), the primary keys are single attributes (e.g., 'customer_id', 'account_number', 'branch_id', 'credential_id'). Therefore, no proper subset exists, precluding any partial key dependency.</w:t>
         <w:br/>
         <w:t>• In 'customer_nominees', the candidate key {customer_id, nominee_name} fully determines {relationship, dob, allocation_percentage}. Neither attribute alone determines the relationship. 2NF is strictly satisfied.</w:t>
       </w:r>
@@ -2766,7 +2766,7 @@
         <w:br/>
         <w:t>• 'accounts': Determinant is {account_number}, which is the candidate key. BCNF Satisfied.</w:t>
         <w:br/>
-        <w:t>• 'cards': Determinant is {card_id}, which is the candidate key. BCNF Satisfied.</w:t>
+        <w:t>• 'account_card_credentials': Determinants are {credential_id} and {account_number, customer_id}, both superkeys. BCNF Satisfied.</w:t>
         <w:br/>
         <w:t>• 'deposits', 'beneficiaries', 'transactions', 'kyc_verifications': All determinants are superkeys. BCNF Satisfied.</w:t>
       </w:r>
@@ -4818,7 +4818,7 @@
                 <w:color w:val="1E293B"/>
                 <w:sz w:val="18"/>
               </w:rPr>
-              <w:t>Eliminates 3NF transitive dependency (account_number -&gt; ifsc_code -&gt; branch_name). Restored via view.</w:t>
+              <w:t>Eliminates 3NF transitive dependency (account_number -&gt; ifsc_code -&gt; branch_name); retained on accounts &amp; joined via v_accounts_legacy for app compatibility.</w:t>
             </w:r>
           </w:p>
         </w:tc>
@@ -5030,7 +5030,7 @@
                 <w:color w:val="1E293B"/>
                 <w:sz w:val="18"/>
               </w:rPr>
-              <w:t>Moved to dedicated 'cards' payment instrument entity.</w:t>
+              <w:t>Moved to dedicated 'account_card_credentials' payment instrument entity while keeping compatibility column on accounts.</w:t>
             </w:r>
           </w:p>
         </w:tc>
@@ -5270,7 +5270,7 @@
                 <w:color w:val="1E293B"/>
                 <w:sz w:val="18"/>
               </w:rPr>
-              <w:t>cards</w:t>
+              <w:t>account_card_credentials</w:t>
             </w:r>
           </w:p>
         </w:tc>
@@ -5348,7 +5348,7 @@
                 <w:color w:val="1E293B"/>
                 <w:sz w:val="18"/>
               </w:rPr>
-              <w:t>Dedicated 1:N payment instrument relation linking masked card, Bcrypt PIN hash, daily limit, and account.</w:t>
+              <w:t>Dedicated 1:N payment credential relation linking account, customer, and genuine Bcrypt PIN hash. 0 fabricated cards or limits.</w:t>
             </w:r>
           </w:p>
         </w:tc>
@@ -5666,7 +5666,7 @@
                 <w:color w:val="1E293B"/>
                 <w:sz w:val="18"/>
               </w:rPr>
-              <w:t>Onboarded missing 'Downtown Central' branch to resolve legacy orphan account ACC-261709.</w:t>
+              <w:t>Onboarded missing 'Downtown Central' branch BR-000 to resolve legacy orphan account ACC-261709.</w:t>
             </w:r>
           </w:p>
         </w:tc>
@@ -6403,7 +6403,7 @@
                 <w:color w:val="1E293B"/>
                 <w:sz w:val="18"/>
               </w:rPr>
-              <w:t>cards</w:t>
+              <w:t>account_card_credentials</w:t>
             </w:r>
           </w:p>
         </w:tc>
@@ -6429,7 +6429,7 @@
                 <w:color w:val="1E293B"/>
                 <w:sz w:val="18"/>
               </w:rPr>
-              <w:t>card_id</w:t>
+              <w:t>credential_id</w:t>
             </w:r>
           </w:p>
         </w:tc>
@@ -6455,7 +6455,7 @@
                 <w:color w:val="1E293B"/>
                 <w:sz w:val="18"/>
               </w:rPr>
-              <w:t>card_id</w:t>
+              <w:t>{account_number, customer_id}</w:t>
             </w:r>
           </w:p>
         </w:tc>
@@ -7626,9 +7626,9 @@
         <w:br/>
         <w:t>+-------------------+          1:N          +-------------------+</w:t>
         <w:br/>
-        <w:t>|     CUSTOMERS     |----------------------&gt;|       CARDS       |</w:t>
+        <w:t>|     CUSTOMERS     |----------------------&gt;|ACCOUNT_CREDENTIALS|</w:t>
         <w:br/>
-        <w:t>| PK: customer_id   |  (ON DELETE CASCADE)  | PK: card_id       |</w:t>
+        <w:t>| PK: customer_id   |  (ON DELETE CASCADE)  | PK: credential_id |</w:t>
         <w:br/>
         <w:t>+-------------------+                       | FK: account_number|</w:t>
         <w:br/>
@@ -7690,13 +7690,13 @@
         <w:br/>
         <w:t>2. Customer Demographics Ingestion: Ingests 124 customer profiles, omitting obsolete nominee and plaintext PIN columns.</w:t>
         <w:br/>
-        <w:t>3. Nominee Decomposition: Selects non-null nominee rows from 'customers' and populates 'customer_nominees' with allocation_percentage = 100.00.</w:t>
+        <w:t>3. Nominee Decomposition: Selects non-null nominee rows from 'customers' (8 rows) and populates 'customer_nominees' with allocation_percentage = 100.00.</w:t>
         <w:br/>
-        <w:t>4. Account Ingestion: Ingests 208 accounts into 'accounts', referencing 'branches(ifsc_code)' directly without redundant branch name text.</w:t>
+        <w:t>4. Account Ingestion: Ingests 208 accounts into 'accounts', referencing 'branches(ifsc_code)' directly while maintaining compatibility columns.</w:t>
         <w:br/>
-        <w:t>5. Card Extraction: Ingests 208 debit card instruments into 'cards' from account records, preserving Bcrypt PIN hashes and masking card numbers.</w:t>
+        <w:t>5. Card Credential Extraction: Ingests 208 debit card credentials into 'account_card_credentials' from account records, preserving genuine Bcrypt PIN hashes without fabricating artificial 16-digit card numbers, fake expirations, or fake daily limits.</w:t>
         <w:br/>
-        <w:t>6. Transaction Channel Parsing: Ingests 782 transactions, identifying external UPI handles (e.g. '@okhdfcbank') and mapping them to 'counterparty_details' while categorizing channel = 'UPI'.</w:t>
+        <w:t>6. Transaction Channel Parsing: Ingests 782 transactions, identifying external UPI handles (30 rows, e.g. '@okhdfcbank') and preserving them in sender_account while categorizing channel = 'UPI'.</w:t>
         <w:br/>
         <w:t>7. Integrity Preservation: Preserves all 74 deposits, 99 beneficiaries, 815 KYC audits, 82 OTP challenges (plaintext scrubbed), 15 liens, 808 audit logs, and 26 rate limits.</w:t>
       </w:r>
@@ -7722,7 +7722,7 @@
         <w:spacing w:after="120"/>
       </w:pPr>
       <w:r>
-        <w:t>A rigorous, automated test suite consisting of 29 relational and financial assertions ('bankist_normalization_tests.sql') was executed on a clean, disposable MySQL database ('bankist_norm_val_*') using the runner script 'execute_normalization_validation.js'. Below are the verified empirical outcomes:</w:t>
+        <w:t>A rigorous, automated test suite consisting of 35 relational, security, domain, and financial assertions ('bankist_normalization_tests.sql') was executed on a clean, disposable MySQL database ('bankist_norm_eval_*') using the runner script 'execute_normalization_validation.js'. Additionally, a 16-query real application compatibility test was executed via 'test_app_compatibility_on_disposable_db.js'. Below are the verified empirical outcomes:</w:t>
       </w:r>
     </w:p>
     <w:tbl>
@@ -8559,7 +8559,7 @@
                 <w:color w:val="1E293B"/>
                 <w:sz w:val="18"/>
               </w:rPr>
-              <w:t>T04C_ORPHAN_CARDS_ACCOUNT</w:t>
+              <w:t>T04C_ORPHAN_CARD_CREDENTIALS_ACCOUNT</w:t>
             </w:r>
           </w:p>
         </w:tc>
@@ -10539,7 +10539,7 @@
                 <w:color w:val="1E293B"/>
                 <w:sz w:val="18"/>
               </w:rPr>
-              <w:t>T07B_CUSTOMERS_COUNT</w:t>
+              <w:t>T07B_TXN_AMOUNT_SUM_CONSERVATION</w:t>
             </w:r>
           </w:p>
         </w:tc>
@@ -10565,7 +10565,7 @@
                 <w:color w:val="1E293B"/>
                 <w:sz w:val="18"/>
               </w:rPr>
-              <w:t>124 Records</w:t>
+              <w:t>₹6,891,891.26</w:t>
             </w:r>
           </w:p>
         </w:tc>
@@ -10591,7 +10591,7 @@
                 <w:color w:val="1E293B"/>
                 <w:sz w:val="18"/>
               </w:rPr>
-              <w:t>124 Records</w:t>
+              <w:t>₹6,891,891.26</w:t>
             </w:r>
           </w:p>
         </w:tc>
@@ -10643,7 +10643,7 @@
                 <w:color w:val="1E293B"/>
                 <w:sz w:val="18"/>
               </w:rPr>
-              <w:t>Customer Baseline Parity</w:t>
+              <w:t>Transaction Volume Parity (₹0.00 Variance)</w:t>
             </w:r>
           </w:p>
         </w:tc>
@@ -10671,7 +10671,7 @@
                 <w:color w:val="1E293B"/>
                 <w:sz w:val="18"/>
               </w:rPr>
-              <w:t>T07C_ACCOUNTS_COUNT</w:t>
+              <w:t>T07C_DEP_PRINCIPAL_SUM_CONSERVATION</w:t>
             </w:r>
           </w:p>
         </w:tc>
@@ -10697,7 +10697,7 @@
                 <w:color w:val="1E293B"/>
                 <w:sz w:val="18"/>
               </w:rPr>
-              <w:t>208 Records</w:t>
+              <w:t>₹2,505,000.00</w:t>
             </w:r>
           </w:p>
         </w:tc>
@@ -10723,7 +10723,7 @@
                 <w:color w:val="1E293B"/>
                 <w:sz w:val="18"/>
               </w:rPr>
-              <w:t>208 Records</w:t>
+              <w:t>₹2,505,000.00</w:t>
             </w:r>
           </w:p>
         </w:tc>
@@ -10775,7 +10775,7 @@
                 <w:color w:val="1E293B"/>
                 <w:sz w:val="18"/>
               </w:rPr>
-              <w:t>Account Baseline Parity</w:t>
+              <w:t>Deposit Principal Parity (₹0.00 Variance)</w:t>
             </w:r>
           </w:p>
         </w:tc>
@@ -10803,7 +10803,7 @@
                 <w:color w:val="1E293B"/>
                 <w:sz w:val="18"/>
               </w:rPr>
-              <w:t>T07D_TRANSACTIONS_COUNT</w:t>
+              <w:t>T07D_CUSTOMERS_COUNT</w:t>
             </w:r>
           </w:p>
         </w:tc>
@@ -10829,7 +10829,7 @@
                 <w:color w:val="1E293B"/>
                 <w:sz w:val="18"/>
               </w:rPr>
-              <w:t>782 Records</w:t>
+              <w:t>124 Records</w:t>
             </w:r>
           </w:p>
         </w:tc>
@@ -10855,7 +10855,7 @@
                 <w:color w:val="1E293B"/>
                 <w:sz w:val="18"/>
               </w:rPr>
-              <w:t>782 Records</w:t>
+              <w:t>124 Records</w:t>
             </w:r>
           </w:p>
         </w:tc>
@@ -10907,7 +10907,7 @@
                 <w:color w:val="1E293B"/>
                 <w:sz w:val="18"/>
               </w:rPr>
-              <w:t>Transaction Ledger Parity</w:t>
+              <w:t>Customer Baseline Parity</w:t>
             </w:r>
           </w:p>
         </w:tc>
@@ -10935,7 +10935,7 @@
                 <w:color w:val="1E293B"/>
                 <w:sz w:val="18"/>
               </w:rPr>
-              <w:t>T07E_DEPOSITS_COUNT</w:t>
+              <w:t>T07E_ACCOUNTS_COUNT</w:t>
             </w:r>
           </w:p>
         </w:tc>
@@ -10961,7 +10961,7 @@
                 <w:color w:val="1E293B"/>
                 <w:sz w:val="18"/>
               </w:rPr>
-              <w:t>74 Records</w:t>
+              <w:t>208 Records</w:t>
             </w:r>
           </w:p>
         </w:tc>
@@ -10987,7 +10987,7 @@
                 <w:color w:val="1E293B"/>
                 <w:sz w:val="18"/>
               </w:rPr>
-              <w:t>74 Records</w:t>
+              <w:t>208 Records</w:t>
             </w:r>
           </w:p>
         </w:tc>
@@ -11039,7 +11039,7 @@
                 <w:color w:val="1E293B"/>
                 <w:sz w:val="18"/>
               </w:rPr>
-              <w:t>Term Deposit Parity</w:t>
+              <w:t>Account Baseline Parity</w:t>
             </w:r>
           </w:p>
         </w:tc>
@@ -11067,7 +11067,7 @@
                 <w:color w:val="1E293B"/>
                 <w:sz w:val="18"/>
               </w:rPr>
-              <w:t>T07F_KYC_VERIFICATIONS_COUNT</w:t>
+              <w:t>T07F_TRANSACTIONS_COUNT</w:t>
             </w:r>
           </w:p>
         </w:tc>
@@ -11093,7 +11093,7 @@
                 <w:color w:val="1E293B"/>
                 <w:sz w:val="18"/>
               </w:rPr>
-              <w:t>815 Records</w:t>
+              <w:t>782 Records</w:t>
             </w:r>
           </w:p>
         </w:tc>
@@ -11119,7 +11119,7 @@
                 <w:color w:val="1E293B"/>
                 <w:sz w:val="18"/>
               </w:rPr>
-              <w:t>815 Records</w:t>
+              <w:t>782 Records</w:t>
             </w:r>
           </w:p>
         </w:tc>
@@ -11171,7 +11171,7 @@
                 <w:color w:val="1E293B"/>
                 <w:sz w:val="18"/>
               </w:rPr>
-              <w:t>Regulatory KYC Parity</w:t>
+              <w:t>Transaction Ledger Parity</w:t>
             </w:r>
           </w:p>
         </w:tc>
@@ -11199,7 +11199,7 @@
                 <w:color w:val="1E293B"/>
                 <w:sz w:val="18"/>
               </w:rPr>
-              <w:t>T07G_BENEFICIARIES_COUNT</w:t>
+              <w:t>T07G_DEPOSITS_COUNT</w:t>
             </w:r>
           </w:p>
         </w:tc>
@@ -11225,7 +11225,7 @@
                 <w:color w:val="1E293B"/>
                 <w:sz w:val="18"/>
               </w:rPr>
-              <w:t>99 Records</w:t>
+              <w:t>74 Records</w:t>
             </w:r>
           </w:p>
         </w:tc>
@@ -11251,7 +11251,7 @@
                 <w:color w:val="1E293B"/>
                 <w:sz w:val="18"/>
               </w:rPr>
-              <w:t>99 Records</w:t>
+              <w:t>74 Records</w:t>
             </w:r>
           </w:p>
         </w:tc>
@@ -11303,7 +11303,7 @@
                 <w:color w:val="1E293B"/>
                 <w:sz w:val="18"/>
               </w:rPr>
-              <w:t>Beneficiary Registry Parity</w:t>
+              <w:t>Term Deposit Parity</w:t>
             </w:r>
           </w:p>
         </w:tc>
@@ -11331,7 +11331,7 @@
                 <w:color w:val="1E293B"/>
                 <w:sz w:val="18"/>
               </w:rPr>
-              <w:t>T07H_CARDS_PARITY_COUNT</w:t>
+              <w:t>T07H_KYC_VERIFICATIONS_COUNT</w:t>
             </w:r>
           </w:p>
         </w:tc>
@@ -11357,7 +11357,7 @@
                 <w:color w:val="1E293B"/>
                 <w:sz w:val="18"/>
               </w:rPr>
-              <w:t>208 Cards</w:t>
+              <w:t>815 Records</w:t>
             </w:r>
           </w:p>
         </w:tc>
@@ -11383,7 +11383,7 @@
                 <w:color w:val="1E293B"/>
                 <w:sz w:val="18"/>
               </w:rPr>
-              <w:t>208 Cards</w:t>
+              <w:t>815 Records</w:t>
             </w:r>
           </w:p>
         </w:tc>
@@ -11435,7 +11435,7 @@
                 <w:color w:val="1E293B"/>
                 <w:sz w:val="18"/>
               </w:rPr>
-              <w:t>1:1 Account Card Instrumentation</w:t>
+              <w:t>Regulatory KYC Parity</w:t>
             </w:r>
           </w:p>
         </w:tc>
@@ -11463,7 +11463,7 @@
                 <w:color w:val="1E293B"/>
                 <w:sz w:val="18"/>
               </w:rPr>
-              <w:t>T08A_VIEW_ACCOUNTS_LEGACY_PARITY</w:t>
+              <w:t>T07I_BENEFICIARIES_COUNT</w:t>
             </w:r>
           </w:p>
         </w:tc>
@@ -11489,7 +11489,7 @@
                 <w:color w:val="1E293B"/>
                 <w:sz w:val="18"/>
               </w:rPr>
-              <w:t>208 Rows, 0 Null</w:t>
+              <w:t>99 Records</w:t>
             </w:r>
           </w:p>
         </w:tc>
@@ -11515,7 +11515,7 @@
                 <w:color w:val="1E293B"/>
                 <w:sz w:val="18"/>
               </w:rPr>
-              <w:t>208 Rows, 0 Null</w:t>
+              <w:t>99 Records</w:t>
             </w:r>
           </w:p>
         </w:tc>
@@ -11567,7 +11567,7 @@
                 <w:color w:val="1E293B"/>
                 <w:sz w:val="18"/>
               </w:rPr>
-              <w:t>Legacy View Reconstruction</w:t>
+              <w:t>Beneficiary Registry Parity</w:t>
             </w:r>
           </w:p>
         </w:tc>
@@ -11595,7 +11595,799 @@
                 <w:color w:val="1E293B"/>
                 <w:sz w:val="18"/>
               </w:rPr>
-              <w:t>T08B_VIEW_PORTFOLIO_LIQUID_BALANCE</w:t>
+              <w:t>T07J_CARD_CREDENTIALS_COUNT</w:t>
+            </w:r>
+          </w:p>
+        </w:tc>
+        <w:tc>
+          <w:tcPr>
+            <w:tcW w:type="dxa" w:w="1584"/>
+            <w:shd w:fill="FFFFFF"/>
+            <w:tcMar>
+              <w:top w:w="80" w:type="dxa"/>
+              <w:bottom w:w="80" w:type="dxa"/>
+              <w:left w:w="120" w:type="dxa"/>
+              <w:right w:w="120" w:type="dxa"/>
+            </w:tcMar>
+          </w:tcPr>
+          <w:p>
+            <w:pPr>
+              <w:spacing w:before="40" w:after="40"/>
+              <w:jc w:val="left"/>
+            </w:pPr>
+            <w:r>
+              <w:rPr>
+                <w:rFonts w:ascii="Calibri" w:hAnsi="Calibri"/>
+                <w:color w:val="1E293B"/>
+                <w:sz w:val="18"/>
+              </w:rPr>
+              <w:t>208 Records</w:t>
+            </w:r>
+          </w:p>
+        </w:tc>
+        <w:tc>
+          <w:tcPr>
+            <w:tcW w:type="dxa" w:w="1584"/>
+            <w:shd w:fill="FFFFFF"/>
+            <w:tcMar>
+              <w:top w:w="80" w:type="dxa"/>
+              <w:bottom w:w="80" w:type="dxa"/>
+              <w:left w:w="120" w:type="dxa"/>
+              <w:right w:w="120" w:type="dxa"/>
+            </w:tcMar>
+          </w:tcPr>
+          <w:p>
+            <w:pPr>
+              <w:spacing w:before="40" w:after="40"/>
+              <w:jc w:val="left"/>
+            </w:pPr>
+            <w:r>
+              <w:rPr>
+                <w:rFonts w:ascii="Calibri" w:hAnsi="Calibri"/>
+                <w:color w:val="1E293B"/>
+                <w:sz w:val="18"/>
+              </w:rPr>
+              <w:t>208 Records</w:t>
+            </w:r>
+          </w:p>
+        </w:tc>
+        <w:tc>
+          <w:tcPr>
+            <w:tcW w:type="dxa" w:w="1296"/>
+            <w:shd w:fill="FFFFFF"/>
+            <w:tcMar>
+              <w:top w:w="80" w:type="dxa"/>
+              <w:bottom w:w="80" w:type="dxa"/>
+              <w:left w:w="120" w:type="dxa"/>
+              <w:right w:w="120" w:type="dxa"/>
+            </w:tcMar>
+          </w:tcPr>
+          <w:p>
+            <w:pPr>
+              <w:spacing w:before="40" w:after="40"/>
+              <w:jc w:val="left"/>
+            </w:pPr>
+            <w:r>
+              <w:rPr>
+                <w:rFonts w:ascii="Calibri" w:hAnsi="Calibri"/>
+                <w:color w:val="1E293B"/>
+                <w:sz w:val="18"/>
+              </w:rPr>
+              <w:t>PASS</w:t>
+            </w:r>
+          </w:p>
+        </w:tc>
+        <w:tc>
+          <w:tcPr>
+            <w:tcW w:type="dxa" w:w="1728"/>
+            <w:shd w:fill="FFFFFF"/>
+            <w:tcMar>
+              <w:top w:w="80" w:type="dxa"/>
+              <w:bottom w:w="80" w:type="dxa"/>
+              <w:left w:w="120" w:type="dxa"/>
+              <w:right w:w="120" w:type="dxa"/>
+            </w:tcMar>
+          </w:tcPr>
+          <w:p>
+            <w:pPr>
+              <w:spacing w:before="40" w:after="40"/>
+              <w:jc w:val="left"/>
+            </w:pPr>
+            <w:r>
+              <w:rPr>
+                <w:rFonts w:ascii="Calibri" w:hAnsi="Calibri"/>
+                <w:color w:val="1E293B"/>
+                <w:sz w:val="18"/>
+              </w:rPr>
+              <w:t>Genuine Account Card Credentials</w:t>
+            </w:r>
+          </w:p>
+        </w:tc>
+      </w:tr>
+      <w:tr>
+        <w:tc>
+          <w:tcPr>
+            <w:tcW w:type="dxa" w:w="3168"/>
+            <w:shd w:fill="F8FAFC"/>
+            <w:tcMar>
+              <w:top w:w="80" w:type="dxa"/>
+              <w:bottom w:w="80" w:type="dxa"/>
+              <w:left w:w="120" w:type="dxa"/>
+              <w:right w:w="120" w:type="dxa"/>
+            </w:tcMar>
+          </w:tcPr>
+          <w:p>
+            <w:pPr>
+              <w:spacing w:before="40" w:after="40"/>
+              <w:jc w:val="left"/>
+            </w:pPr>
+            <w:r>
+              <w:rPr>
+                <w:rFonts w:ascii="Calibri" w:hAnsi="Calibri"/>
+                <w:color w:val="1E293B"/>
+                <w:sz w:val="18"/>
+              </w:rPr>
+              <w:t>T07K_CUSTOMER_NOMINEES_COUNT</w:t>
+            </w:r>
+          </w:p>
+        </w:tc>
+        <w:tc>
+          <w:tcPr>
+            <w:tcW w:type="dxa" w:w="1584"/>
+            <w:shd w:fill="F8FAFC"/>
+            <w:tcMar>
+              <w:top w:w="80" w:type="dxa"/>
+              <w:bottom w:w="80" w:type="dxa"/>
+              <w:left w:w="120" w:type="dxa"/>
+              <w:right w:w="120" w:type="dxa"/>
+            </w:tcMar>
+          </w:tcPr>
+          <w:p>
+            <w:pPr>
+              <w:spacing w:before="40" w:after="40"/>
+              <w:jc w:val="left"/>
+            </w:pPr>
+            <w:r>
+              <w:rPr>
+                <w:rFonts w:ascii="Calibri" w:hAnsi="Calibri"/>
+                <w:color w:val="1E293B"/>
+                <w:sz w:val="18"/>
+              </w:rPr>
+              <w:t>8 Nominees</w:t>
+            </w:r>
+          </w:p>
+        </w:tc>
+        <w:tc>
+          <w:tcPr>
+            <w:tcW w:type="dxa" w:w="1584"/>
+            <w:shd w:fill="F8FAFC"/>
+            <w:tcMar>
+              <w:top w:w="80" w:type="dxa"/>
+              <w:bottom w:w="80" w:type="dxa"/>
+              <w:left w:w="120" w:type="dxa"/>
+              <w:right w:w="120" w:type="dxa"/>
+            </w:tcMar>
+          </w:tcPr>
+          <w:p>
+            <w:pPr>
+              <w:spacing w:before="40" w:after="40"/>
+              <w:jc w:val="left"/>
+            </w:pPr>
+            <w:r>
+              <w:rPr>
+                <w:rFonts w:ascii="Calibri" w:hAnsi="Calibri"/>
+                <w:color w:val="1E293B"/>
+                <w:sz w:val="18"/>
+              </w:rPr>
+              <w:t>8 Nominees</w:t>
+            </w:r>
+          </w:p>
+        </w:tc>
+        <w:tc>
+          <w:tcPr>
+            <w:tcW w:type="dxa" w:w="1296"/>
+            <w:shd w:fill="F8FAFC"/>
+            <w:tcMar>
+              <w:top w:w="80" w:type="dxa"/>
+              <w:bottom w:w="80" w:type="dxa"/>
+              <w:left w:w="120" w:type="dxa"/>
+              <w:right w:w="120" w:type="dxa"/>
+            </w:tcMar>
+          </w:tcPr>
+          <w:p>
+            <w:pPr>
+              <w:spacing w:before="40" w:after="40"/>
+              <w:jc w:val="left"/>
+            </w:pPr>
+            <w:r>
+              <w:rPr>
+                <w:rFonts w:ascii="Calibri" w:hAnsi="Calibri"/>
+                <w:color w:val="1E293B"/>
+                <w:sz w:val="18"/>
+              </w:rPr>
+              <w:t>PASS</w:t>
+            </w:r>
+          </w:p>
+        </w:tc>
+        <w:tc>
+          <w:tcPr>
+            <w:tcW w:type="dxa" w:w="1728"/>
+            <w:shd w:fill="F8FAFC"/>
+            <w:tcMar>
+              <w:top w:w="80" w:type="dxa"/>
+              <w:bottom w:w="80" w:type="dxa"/>
+              <w:left w:w="120" w:type="dxa"/>
+              <w:right w:w="120" w:type="dxa"/>
+            </w:tcMar>
+          </w:tcPr>
+          <w:p>
+            <w:pPr>
+              <w:spacing w:before="40" w:after="40"/>
+              <w:jc w:val="left"/>
+            </w:pPr>
+            <w:r>
+              <w:rPr>
+                <w:rFonts w:ascii="Calibri" w:hAnsi="Calibri"/>
+                <w:color w:val="1E293B"/>
+                <w:sz w:val="18"/>
+              </w:rPr>
+              <w:t>Customer Nominees Parity</w:t>
+            </w:r>
+          </w:p>
+        </w:tc>
+      </w:tr>
+      <w:tr>
+        <w:tc>
+          <w:tcPr>
+            <w:tcW w:type="dxa" w:w="3168"/>
+            <w:shd w:fill="FFFFFF"/>
+            <w:tcMar>
+              <w:top w:w="80" w:type="dxa"/>
+              <w:bottom w:w="80" w:type="dxa"/>
+              <w:left w:w="120" w:type="dxa"/>
+              <w:right w:w="120" w:type="dxa"/>
+            </w:tcMar>
+          </w:tcPr>
+          <w:p>
+            <w:pPr>
+              <w:spacing w:before="40" w:after="40"/>
+              <w:jc w:val="left"/>
+            </w:pPr>
+            <w:r>
+              <w:rPr>
+                <w:rFonts w:ascii="Calibri" w:hAnsi="Calibri"/>
+                <w:color w:val="1E293B"/>
+                <w:sz w:val="18"/>
+              </w:rPr>
+              <w:t>T07L_LIENS_COUNT</w:t>
+            </w:r>
+          </w:p>
+        </w:tc>
+        <w:tc>
+          <w:tcPr>
+            <w:tcW w:type="dxa" w:w="1584"/>
+            <w:shd w:fill="FFFFFF"/>
+            <w:tcMar>
+              <w:top w:w="80" w:type="dxa"/>
+              <w:bottom w:w="80" w:type="dxa"/>
+              <w:left w:w="120" w:type="dxa"/>
+              <w:right w:w="120" w:type="dxa"/>
+            </w:tcMar>
+          </w:tcPr>
+          <w:p>
+            <w:pPr>
+              <w:spacing w:before="40" w:after="40"/>
+              <w:jc w:val="left"/>
+            </w:pPr>
+            <w:r>
+              <w:rPr>
+                <w:rFonts w:ascii="Calibri" w:hAnsi="Calibri"/>
+                <w:color w:val="1E293B"/>
+                <w:sz w:val="18"/>
+              </w:rPr>
+              <w:t>15 Liens</w:t>
+            </w:r>
+          </w:p>
+        </w:tc>
+        <w:tc>
+          <w:tcPr>
+            <w:tcW w:type="dxa" w:w="1584"/>
+            <w:shd w:fill="FFFFFF"/>
+            <w:tcMar>
+              <w:top w:w="80" w:type="dxa"/>
+              <w:bottom w:w="80" w:type="dxa"/>
+              <w:left w:w="120" w:type="dxa"/>
+              <w:right w:w="120" w:type="dxa"/>
+            </w:tcMar>
+          </w:tcPr>
+          <w:p>
+            <w:pPr>
+              <w:spacing w:before="40" w:after="40"/>
+              <w:jc w:val="left"/>
+            </w:pPr>
+            <w:r>
+              <w:rPr>
+                <w:rFonts w:ascii="Calibri" w:hAnsi="Calibri"/>
+                <w:color w:val="1E293B"/>
+                <w:sz w:val="18"/>
+              </w:rPr>
+              <w:t>15 Liens</w:t>
+            </w:r>
+          </w:p>
+        </w:tc>
+        <w:tc>
+          <w:tcPr>
+            <w:tcW w:type="dxa" w:w="1296"/>
+            <w:shd w:fill="FFFFFF"/>
+            <w:tcMar>
+              <w:top w:w="80" w:type="dxa"/>
+              <w:bottom w:w="80" w:type="dxa"/>
+              <w:left w:w="120" w:type="dxa"/>
+              <w:right w:w="120" w:type="dxa"/>
+            </w:tcMar>
+          </w:tcPr>
+          <w:p>
+            <w:pPr>
+              <w:spacing w:before="40" w:after="40"/>
+              <w:jc w:val="left"/>
+            </w:pPr>
+            <w:r>
+              <w:rPr>
+                <w:rFonts w:ascii="Calibri" w:hAnsi="Calibri"/>
+                <w:color w:val="1E293B"/>
+                <w:sz w:val="18"/>
+              </w:rPr>
+              <w:t>PASS</w:t>
+            </w:r>
+          </w:p>
+        </w:tc>
+        <w:tc>
+          <w:tcPr>
+            <w:tcW w:type="dxa" w:w="1728"/>
+            <w:shd w:fill="FFFFFF"/>
+            <w:tcMar>
+              <w:top w:w="80" w:type="dxa"/>
+              <w:bottom w:w="80" w:type="dxa"/>
+              <w:left w:w="120" w:type="dxa"/>
+              <w:right w:w="120" w:type="dxa"/>
+            </w:tcMar>
+          </w:tcPr>
+          <w:p>
+            <w:pPr>
+              <w:spacing w:before="40" w:after="40"/>
+              <w:jc w:val="left"/>
+            </w:pPr>
+            <w:r>
+              <w:rPr>
+                <w:rFonts w:ascii="Calibri" w:hAnsi="Calibri"/>
+                <w:color w:val="1E293B"/>
+                <w:sz w:val="18"/>
+              </w:rPr>
+              <w:t>Account Lien Records Parity</w:t>
+            </w:r>
+          </w:p>
+        </w:tc>
+      </w:tr>
+      <w:tr>
+        <w:tc>
+          <w:tcPr>
+            <w:tcW w:type="dxa" w:w="3168"/>
+            <w:shd w:fill="F8FAFC"/>
+            <w:tcMar>
+              <w:top w:w="80" w:type="dxa"/>
+              <w:bottom w:w="80" w:type="dxa"/>
+              <w:left w:w="120" w:type="dxa"/>
+              <w:right w:w="120" w:type="dxa"/>
+            </w:tcMar>
+          </w:tcPr>
+          <w:p>
+            <w:pPr>
+              <w:spacing w:before="40" w:after="40"/>
+              <w:jc w:val="left"/>
+            </w:pPr>
+            <w:r>
+              <w:rPr>
+                <w:rFonts w:ascii="Calibri" w:hAnsi="Calibri"/>
+                <w:color w:val="1E293B"/>
+                <w:sz w:val="18"/>
+              </w:rPr>
+              <w:t>T08A_PRESERVED_UPI_SENDERS</w:t>
+            </w:r>
+          </w:p>
+        </w:tc>
+        <w:tc>
+          <w:tcPr>
+            <w:tcW w:type="dxa" w:w="1584"/>
+            <w:shd w:fill="F8FAFC"/>
+            <w:tcMar>
+              <w:top w:w="80" w:type="dxa"/>
+              <w:bottom w:w="80" w:type="dxa"/>
+              <w:left w:w="120" w:type="dxa"/>
+              <w:right w:w="120" w:type="dxa"/>
+            </w:tcMar>
+          </w:tcPr>
+          <w:p>
+            <w:pPr>
+              <w:spacing w:before="40" w:after="40"/>
+              <w:jc w:val="left"/>
+            </w:pPr>
+            <w:r>
+              <w:rPr>
+                <w:rFonts w:ascii="Calibri" w:hAnsi="Calibri"/>
+                <w:color w:val="1E293B"/>
+                <w:sz w:val="18"/>
+              </w:rPr>
+              <w:t>30 Preserved</w:t>
+            </w:r>
+          </w:p>
+        </w:tc>
+        <w:tc>
+          <w:tcPr>
+            <w:tcW w:type="dxa" w:w="1584"/>
+            <w:shd w:fill="F8FAFC"/>
+            <w:tcMar>
+              <w:top w:w="80" w:type="dxa"/>
+              <w:bottom w:w="80" w:type="dxa"/>
+              <w:left w:w="120" w:type="dxa"/>
+              <w:right w:w="120" w:type="dxa"/>
+            </w:tcMar>
+          </w:tcPr>
+          <w:p>
+            <w:pPr>
+              <w:spacing w:before="40" w:after="40"/>
+              <w:jc w:val="left"/>
+            </w:pPr>
+            <w:r>
+              <w:rPr>
+                <w:rFonts w:ascii="Calibri" w:hAnsi="Calibri"/>
+                <w:color w:val="1E293B"/>
+                <w:sz w:val="18"/>
+              </w:rPr>
+              <w:t>30 Preserved</w:t>
+            </w:r>
+          </w:p>
+        </w:tc>
+        <w:tc>
+          <w:tcPr>
+            <w:tcW w:type="dxa" w:w="1296"/>
+            <w:shd w:fill="F8FAFC"/>
+            <w:tcMar>
+              <w:top w:w="80" w:type="dxa"/>
+              <w:bottom w:w="80" w:type="dxa"/>
+              <w:left w:w="120" w:type="dxa"/>
+              <w:right w:w="120" w:type="dxa"/>
+            </w:tcMar>
+          </w:tcPr>
+          <w:p>
+            <w:pPr>
+              <w:spacing w:before="40" w:after="40"/>
+              <w:jc w:val="left"/>
+            </w:pPr>
+            <w:r>
+              <w:rPr>
+                <w:rFonts w:ascii="Calibri" w:hAnsi="Calibri"/>
+                <w:color w:val="1E293B"/>
+                <w:sz w:val="18"/>
+              </w:rPr>
+              <w:t>PASS</w:t>
+            </w:r>
+          </w:p>
+        </w:tc>
+        <w:tc>
+          <w:tcPr>
+            <w:tcW w:type="dxa" w:w="1728"/>
+            <w:shd w:fill="F8FAFC"/>
+            <w:tcMar>
+              <w:top w:w="80" w:type="dxa"/>
+              <w:bottom w:w="80" w:type="dxa"/>
+              <w:left w:w="120" w:type="dxa"/>
+              <w:right w:w="120" w:type="dxa"/>
+            </w:tcMar>
+          </w:tcPr>
+          <w:p>
+            <w:pPr>
+              <w:spacing w:before="40" w:after="40"/>
+              <w:jc w:val="left"/>
+            </w:pPr>
+            <w:r>
+              <w:rPr>
+                <w:rFonts w:ascii="Calibri" w:hAnsi="Calibri"/>
+                <w:color w:val="1E293B"/>
+                <w:sz w:val="18"/>
+              </w:rPr>
+              <w:t>Preserved External UPI VPAs</w:t>
+            </w:r>
+          </w:p>
+        </w:tc>
+      </w:tr>
+      <w:tr>
+        <w:tc>
+          <w:tcPr>
+            <w:tcW w:type="dxa" w:w="3168"/>
+            <w:shd w:fill="FFFFFF"/>
+            <w:tcMar>
+              <w:top w:w="80" w:type="dxa"/>
+              <w:bottom w:w="80" w:type="dxa"/>
+              <w:left w:w="120" w:type="dxa"/>
+              <w:right w:w="120" w:type="dxa"/>
+            </w:tcMar>
+          </w:tcPr>
+          <w:p>
+            <w:pPr>
+              <w:spacing w:before="40" w:after="40"/>
+              <w:jc w:val="left"/>
+            </w:pPr>
+            <w:r>
+              <w:rPr>
+                <w:rFonts w:ascii="Calibri" w:hAnsi="Calibri"/>
+                <w:color w:val="1E293B"/>
+                <w:sz w:val="18"/>
+              </w:rPr>
+              <w:t>T09A_VIEW_ACCOUNTS_LEGACY_PARITY</w:t>
+            </w:r>
+          </w:p>
+        </w:tc>
+        <w:tc>
+          <w:tcPr>
+            <w:tcW w:type="dxa" w:w="1584"/>
+            <w:shd w:fill="FFFFFF"/>
+            <w:tcMar>
+              <w:top w:w="80" w:type="dxa"/>
+              <w:bottom w:w="80" w:type="dxa"/>
+              <w:left w:w="120" w:type="dxa"/>
+              <w:right w:w="120" w:type="dxa"/>
+            </w:tcMar>
+          </w:tcPr>
+          <w:p>
+            <w:pPr>
+              <w:spacing w:before="40" w:after="40"/>
+              <w:jc w:val="left"/>
+            </w:pPr>
+            <w:r>
+              <w:rPr>
+                <w:rFonts w:ascii="Calibri" w:hAnsi="Calibri"/>
+                <w:color w:val="1E293B"/>
+                <w:sz w:val="18"/>
+              </w:rPr>
+              <w:t>208 Rows, 0 Null</w:t>
+            </w:r>
+          </w:p>
+        </w:tc>
+        <w:tc>
+          <w:tcPr>
+            <w:tcW w:type="dxa" w:w="1584"/>
+            <w:shd w:fill="FFFFFF"/>
+            <w:tcMar>
+              <w:top w:w="80" w:type="dxa"/>
+              <w:bottom w:w="80" w:type="dxa"/>
+              <w:left w:w="120" w:type="dxa"/>
+              <w:right w:w="120" w:type="dxa"/>
+            </w:tcMar>
+          </w:tcPr>
+          <w:p>
+            <w:pPr>
+              <w:spacing w:before="40" w:after="40"/>
+              <w:jc w:val="left"/>
+            </w:pPr>
+            <w:r>
+              <w:rPr>
+                <w:rFonts w:ascii="Calibri" w:hAnsi="Calibri"/>
+                <w:color w:val="1E293B"/>
+                <w:sz w:val="18"/>
+              </w:rPr>
+              <w:t>208 Rows, 0 Null</w:t>
+            </w:r>
+          </w:p>
+        </w:tc>
+        <w:tc>
+          <w:tcPr>
+            <w:tcW w:type="dxa" w:w="1296"/>
+            <w:shd w:fill="FFFFFF"/>
+            <w:tcMar>
+              <w:top w:w="80" w:type="dxa"/>
+              <w:bottom w:w="80" w:type="dxa"/>
+              <w:left w:w="120" w:type="dxa"/>
+              <w:right w:w="120" w:type="dxa"/>
+            </w:tcMar>
+          </w:tcPr>
+          <w:p>
+            <w:pPr>
+              <w:spacing w:before="40" w:after="40"/>
+              <w:jc w:val="left"/>
+            </w:pPr>
+            <w:r>
+              <w:rPr>
+                <w:rFonts w:ascii="Calibri" w:hAnsi="Calibri"/>
+                <w:color w:val="1E293B"/>
+                <w:sz w:val="18"/>
+              </w:rPr>
+              <w:t>PASS</w:t>
+            </w:r>
+          </w:p>
+        </w:tc>
+        <w:tc>
+          <w:tcPr>
+            <w:tcW w:type="dxa" w:w="1728"/>
+            <w:shd w:fill="FFFFFF"/>
+            <w:tcMar>
+              <w:top w:w="80" w:type="dxa"/>
+              <w:bottom w:w="80" w:type="dxa"/>
+              <w:left w:w="120" w:type="dxa"/>
+              <w:right w:w="120" w:type="dxa"/>
+            </w:tcMar>
+          </w:tcPr>
+          <w:p>
+            <w:pPr>
+              <w:spacing w:before="40" w:after="40"/>
+              <w:jc w:val="left"/>
+            </w:pPr>
+            <w:r>
+              <w:rPr>
+                <w:rFonts w:ascii="Calibri" w:hAnsi="Calibri"/>
+                <w:color w:val="1E293B"/>
+                <w:sz w:val="18"/>
+              </w:rPr>
+              <w:t>Legacy View Reconstruction</w:t>
+            </w:r>
+          </w:p>
+        </w:tc>
+      </w:tr>
+      <w:tr>
+        <w:tc>
+          <w:tcPr>
+            <w:tcW w:type="dxa" w:w="3168"/>
+            <w:shd w:fill="F8FAFC"/>
+            <w:tcMar>
+              <w:top w:w="80" w:type="dxa"/>
+              <w:bottom w:w="80" w:type="dxa"/>
+              <w:left w:w="120" w:type="dxa"/>
+              <w:right w:w="120" w:type="dxa"/>
+            </w:tcMar>
+          </w:tcPr>
+          <w:p>
+            <w:pPr>
+              <w:spacing w:before="40" w:after="40"/>
+              <w:jc w:val="left"/>
+            </w:pPr>
+            <w:r>
+              <w:rPr>
+                <w:rFonts w:ascii="Calibri" w:hAnsi="Calibri"/>
+                <w:color w:val="1E293B"/>
+                <w:sz w:val="18"/>
+              </w:rPr>
+              <w:t>T09B_VIEW_CUSTOMERS_LEGACY_NOMINEE_COUNT</w:t>
+            </w:r>
+          </w:p>
+        </w:tc>
+        <w:tc>
+          <w:tcPr>
+            <w:tcW w:type="dxa" w:w="1584"/>
+            <w:shd w:fill="F8FAFC"/>
+            <w:tcMar>
+              <w:top w:w="80" w:type="dxa"/>
+              <w:bottom w:w="80" w:type="dxa"/>
+              <w:left w:w="120" w:type="dxa"/>
+              <w:right w:w="120" w:type="dxa"/>
+            </w:tcMar>
+          </w:tcPr>
+          <w:p>
+            <w:pPr>
+              <w:spacing w:before="40" w:after="40"/>
+              <w:jc w:val="left"/>
+            </w:pPr>
+            <w:r>
+              <w:rPr>
+                <w:rFonts w:ascii="Calibri" w:hAnsi="Calibri"/>
+                <w:color w:val="1E293B"/>
+                <w:sz w:val="18"/>
+              </w:rPr>
+              <w:t>8 Nominees</w:t>
+            </w:r>
+          </w:p>
+        </w:tc>
+        <w:tc>
+          <w:tcPr>
+            <w:tcW w:type="dxa" w:w="1584"/>
+            <w:shd w:fill="F8FAFC"/>
+            <w:tcMar>
+              <w:top w:w="80" w:type="dxa"/>
+              <w:bottom w:w="80" w:type="dxa"/>
+              <w:left w:w="120" w:type="dxa"/>
+              <w:right w:w="120" w:type="dxa"/>
+            </w:tcMar>
+          </w:tcPr>
+          <w:p>
+            <w:pPr>
+              <w:spacing w:before="40" w:after="40"/>
+              <w:jc w:val="left"/>
+            </w:pPr>
+            <w:r>
+              <w:rPr>
+                <w:rFonts w:ascii="Calibri" w:hAnsi="Calibri"/>
+                <w:color w:val="1E293B"/>
+                <w:sz w:val="18"/>
+              </w:rPr>
+              <w:t>8 Nominees</w:t>
+            </w:r>
+          </w:p>
+        </w:tc>
+        <w:tc>
+          <w:tcPr>
+            <w:tcW w:type="dxa" w:w="1296"/>
+            <w:shd w:fill="F8FAFC"/>
+            <w:tcMar>
+              <w:top w:w="80" w:type="dxa"/>
+              <w:bottom w:w="80" w:type="dxa"/>
+              <w:left w:w="120" w:type="dxa"/>
+              <w:right w:w="120" w:type="dxa"/>
+            </w:tcMar>
+          </w:tcPr>
+          <w:p>
+            <w:pPr>
+              <w:spacing w:before="40" w:after="40"/>
+              <w:jc w:val="left"/>
+            </w:pPr>
+            <w:r>
+              <w:rPr>
+                <w:rFonts w:ascii="Calibri" w:hAnsi="Calibri"/>
+                <w:color w:val="1E293B"/>
+                <w:sz w:val="18"/>
+              </w:rPr>
+              <w:t>PASS</w:t>
+            </w:r>
+          </w:p>
+        </w:tc>
+        <w:tc>
+          <w:tcPr>
+            <w:tcW w:type="dxa" w:w="1728"/>
+            <w:shd w:fill="F8FAFC"/>
+            <w:tcMar>
+              <w:top w:w="80" w:type="dxa"/>
+              <w:bottom w:w="80" w:type="dxa"/>
+              <w:left w:w="120" w:type="dxa"/>
+              <w:right w:w="120" w:type="dxa"/>
+            </w:tcMar>
+          </w:tcPr>
+          <w:p>
+            <w:pPr>
+              <w:spacing w:before="40" w:after="40"/>
+              <w:jc w:val="left"/>
+            </w:pPr>
+            <w:r>
+              <w:rPr>
+                <w:rFonts w:ascii="Calibri" w:hAnsi="Calibri"/>
+                <w:color w:val="1E293B"/>
+                <w:sz w:val="18"/>
+              </w:rPr>
+              <w:t>Legacy Customers View Join</w:t>
+            </w:r>
+          </w:p>
+        </w:tc>
+      </w:tr>
+      <w:tr>
+        <w:tc>
+          <w:tcPr>
+            <w:tcW w:type="dxa" w:w="3168"/>
+            <w:shd w:fill="FFFFFF"/>
+            <w:tcMar>
+              <w:top w:w="80" w:type="dxa"/>
+              <w:bottom w:w="80" w:type="dxa"/>
+              <w:left w:w="120" w:type="dxa"/>
+              <w:right w:w="120" w:type="dxa"/>
+            </w:tcMar>
+          </w:tcPr>
+          <w:p>
+            <w:pPr>
+              <w:spacing w:before="40" w:after="40"/>
+              <w:jc w:val="left"/>
+            </w:pPr>
+            <w:r>
+              <w:rPr>
+                <w:rFonts w:ascii="Calibri" w:hAnsi="Calibri"/>
+                <w:color w:val="1E293B"/>
+                <w:sz w:val="18"/>
+              </w:rPr>
+              <w:t>T09C_VIEW_PORTFOLIO_LIQUID_BALANCE</w:t>
             </w:r>
           </w:p>
         </w:tc>
@@ -11711,7 +12503,7 @@
       </w:pPr>
       <w:r>
         <w:br/>
-        <w:t>Summary of Validation Results: 29 assertions executed; 29 assertions PASSED; 0 FAILED. The financial ledger balance sum was conserved to the exact penny: ₹19,155,216.07 with zero unexplained variance.</w:t>
+        <w:t>Summary of Validation Results: 35 assertions executed; 35 assertions PASSED; 0 FAILED. The financial ledger balance sum was conserved to the exact penny: ₹19,155,216.07 with zero unexplained variance. Application compatibility testing against disposable databases confirmed 16 out of 16 Next.js net-banking queries passed cleanly.</w:t>
       </w:r>
     </w:p>
     <w:p>
@@ -11744,16 +12536,16 @@
         <w:br/>
         <w:t xml:space="preserve">   • Creation of 'bankist_migration.sql' performing safe, lossless data migration from the original schema.</w:t>
         <w:br/>
-        <w:t xml:space="preserve">   • Creation of 'bankist_normalization_tests.sql' executing all 29 empirical assertions.</w:t>
+        <w:t xml:space="preserve">   • Creation of 'bankist_normalization_tests.sql' executing all 35 empirical assertions.</w:t>
         <w:br/>
         <w:t xml:space="preserve">   • Empirical proof of 100% test pass rate and ₹0.00 financial variance in disposable test environments.</w:t>
         <w:br/>
-        <w:t xml:space="preserve">   • Preservation of live 'bankist' in an untouched, pristine state.</w:t>
+        <w:t xml:space="preserve">   • Preservation of live 'bankist' in an untouched, pristine state (SHA-256 fingerprint verified before and after).</w:t>
         <w:br/>
         <w:br/>
         <w:t>2. Strategic Trade-Offs &amp; Analytical Views:</w:t>
         <w:br/>
-        <w:t xml:space="preserve">   • Normalizing 'branch_name' out of 'accounts' requires a relational JOIN against 'branches' whenever an account listing is rendered. To maintain sub-millisecond query performance and eliminate any risk of breaking existing Next.js net-banking API routes, we introduced 'v_accounts_legacy' which pre-joins 'accounts', 'branches', and 'cards'.</w:t>
+        <w:t xml:space="preserve">   • Normalizing 'branch_name' out of 'accounts' requires a relational JOIN against 'branches' whenever an account listing is rendered. To maintain sub-millisecond query performance and eliminate any risk of breaking existing Next.js net-banking API routes, we introduced 'v_accounts_legacy' which pre-joins 'accounts' and 'branches', while maintaining compatibility columns on 'accounts'.</w:t>
         <w:br/>
         <w:t xml:space="preserve">   • Nominee De-embedding: In 'v_customers_legacy', nominee attributes are joined using a GROUP BY subquery to project the primary nominee, ensuring that legacy front-end profile views continue to render seamlessly without code changes.</w:t>
         <w:br/>
@@ -11813,7 +12605,7 @@
         <w:br/>
         <w:t xml:space="preserve">   node scripts/execute_normalization_validation.js</w:t>
         <w:br/>
-        <w:t xml:space="preserve">   Verify that all 29 assertions output [PASS] and that the live database remains untouched.</w:t>
+        <w:t xml:space="preserve">   Verify that all 35 assertions output [PASS] and that the live database remains untouched.</w:t>
         <w:br/>
         <w:br/>
         <w:t>Step 3: Safe Production Cutover (When Approved)</w:t>
@@ -11822,7 +12614,7 @@
         <w:br/>
         <w:t xml:space="preserve">      mysqldump -u root -p --single-transaction --routines --triggers bankist &gt; bankist_pre_norm_backup.sql</w:t>
         <w:br/>
-        <w:t xml:space="preserve">   2. Apply migration to a shadow database 'bankist_v2'.</w:t>
+        <w:t xml:space="preserve">   2. Apply migration to a shadow database 'bankist_stage'.</w:t>
         <w:br/>
         <w:t xml:space="preserve">   3. Verify row counts and balance sum (₹19,155,216.07).</w:t>
         <w:br/>

</xml_diff>

<commit_message>
fix(dbms): repair SQL error 1055, migration safety guard, overwrite prevention & card auth
</commit_message>
<xml_diff>
--- a/BANKIST_NORMALIZATION_DOCUMENTATION.docx
+++ b/BANKIST_NORMALIZATION_DOCUMENTATION.docx
@@ -7722,7 +7722,7 @@
         <w:spacing w:after="120"/>
       </w:pPr>
       <w:r>
-        <w:t>A rigorous, automated test suite consisting of 35 relational, security, domain, and financial assertions ('bankist_normalization_tests.sql') was executed on a clean, disposable MySQL database ('bankist_norm_eval_*') using the runner script 'execute_normalization_validation.js'. Additionally, a 16-query real application compatibility test was executed via 'test_app_compatibility_on_disposable_db.js'. Below are the verified empirical outcomes:</w:t>
+        <w:t>A rigorous, automated test suite consisting of 37 relational, security, domain, and financial assertions ('bankist_normalization_tests.sql') was executed on a clean, disposable MySQL database ('bankist_norm_eval_*') using the runner script 'execute_normalization_validation.js'. Additionally, a 27-query real application compatibility test was executed via 'test_app_compatibility_on_disposable_db.js'. Below are the verified empirical outcomes:</w:t>
       </w:r>
     </w:p>
     <w:tbl>
@@ -12496,6 +12496,270 @@
           </w:p>
         </w:tc>
       </w:tr>
+      <w:tr>
+        <w:tc>
+          <w:tcPr>
+            <w:tcW w:type="dxa" w:w="3168"/>
+            <w:shd w:fill="F8FAFC"/>
+            <w:tcMar>
+              <w:top w:w="80" w:type="dxa"/>
+              <w:bottom w:w="80" w:type="dxa"/>
+              <w:left w:w="120" w:type="dxa"/>
+              <w:right w:w="120" w:type="dxa"/>
+            </w:tcMar>
+          </w:tcPr>
+          <w:p>
+            <w:pPr>
+              <w:spacing w:before="40" w:after="40"/>
+              <w:jc w:val="left"/>
+            </w:pPr>
+            <w:r>
+              <w:rPr>
+                <w:rFonts w:ascii="Calibri" w:hAnsi="Calibri"/>
+                <w:color w:val="1E293B"/>
+                <w:sz w:val="18"/>
+              </w:rPr>
+              <w:t>T09D_VIEW_CUSTOMERS_ONLY_FULL_GROUP_BY_STRICT</w:t>
+            </w:r>
+          </w:p>
+        </w:tc>
+        <w:tc>
+          <w:tcPr>
+            <w:tcW w:type="dxa" w:w="1584"/>
+            <w:shd w:fill="F8FAFC"/>
+            <w:tcMar>
+              <w:top w:w="80" w:type="dxa"/>
+              <w:bottom w:w="80" w:type="dxa"/>
+              <w:left w:w="120" w:type="dxa"/>
+              <w:right w:w="120" w:type="dxa"/>
+            </w:tcMar>
+          </w:tcPr>
+          <w:p>
+            <w:pPr>
+              <w:spacing w:before="40" w:after="40"/>
+              <w:jc w:val="left"/>
+            </w:pPr>
+            <w:r>
+              <w:rPr>
+                <w:rFonts w:ascii="Calibri" w:hAnsi="Calibri"/>
+                <w:color w:val="1E293B"/>
+                <w:sz w:val="18"/>
+              </w:rPr>
+              <w:t>124 Rows</w:t>
+            </w:r>
+          </w:p>
+        </w:tc>
+        <w:tc>
+          <w:tcPr>
+            <w:tcW w:type="dxa" w:w="1584"/>
+            <w:shd w:fill="F8FAFC"/>
+            <w:tcMar>
+              <w:top w:w="80" w:type="dxa"/>
+              <w:bottom w:w="80" w:type="dxa"/>
+              <w:left w:w="120" w:type="dxa"/>
+              <w:right w:w="120" w:type="dxa"/>
+            </w:tcMar>
+          </w:tcPr>
+          <w:p>
+            <w:pPr>
+              <w:spacing w:before="40" w:after="40"/>
+              <w:jc w:val="left"/>
+            </w:pPr>
+            <w:r>
+              <w:rPr>
+                <w:rFonts w:ascii="Calibri" w:hAnsi="Calibri"/>
+                <w:color w:val="1E293B"/>
+                <w:sz w:val="18"/>
+              </w:rPr>
+              <w:t>124 Rows</w:t>
+            </w:r>
+          </w:p>
+        </w:tc>
+        <w:tc>
+          <w:tcPr>
+            <w:tcW w:type="dxa" w:w="1296"/>
+            <w:shd w:fill="F8FAFC"/>
+            <w:tcMar>
+              <w:top w:w="80" w:type="dxa"/>
+              <w:bottom w:w="80" w:type="dxa"/>
+              <w:left w:w="120" w:type="dxa"/>
+              <w:right w:w="120" w:type="dxa"/>
+            </w:tcMar>
+          </w:tcPr>
+          <w:p>
+            <w:pPr>
+              <w:spacing w:before="40" w:after="40"/>
+              <w:jc w:val="left"/>
+            </w:pPr>
+            <w:r>
+              <w:rPr>
+                <w:rFonts w:ascii="Calibri" w:hAnsi="Calibri"/>
+                <w:color w:val="1E293B"/>
+                <w:sz w:val="18"/>
+              </w:rPr>
+              <w:t>PASS</w:t>
+            </w:r>
+          </w:p>
+        </w:tc>
+        <w:tc>
+          <w:tcPr>
+            <w:tcW w:type="dxa" w:w="1728"/>
+            <w:shd w:fill="F8FAFC"/>
+            <w:tcMar>
+              <w:top w:w="80" w:type="dxa"/>
+              <w:bottom w:w="80" w:type="dxa"/>
+              <w:left w:w="120" w:type="dxa"/>
+              <w:right w:w="120" w:type="dxa"/>
+            </w:tcMar>
+          </w:tcPr>
+          <w:p>
+            <w:pPr>
+              <w:spacing w:before="40" w:after="40"/>
+              <w:jc w:val="left"/>
+            </w:pPr>
+            <w:r>
+              <w:rPr>
+                <w:rFonts w:ascii="Calibri" w:hAnsi="Calibri"/>
+                <w:color w:val="1E293B"/>
+                <w:sz w:val="18"/>
+              </w:rPr>
+              <w:t>Strict ONLY_FULL_GROUP_BY Compliance</w:t>
+            </w:r>
+          </w:p>
+        </w:tc>
+      </w:tr>
+      <w:tr>
+        <w:tc>
+          <w:tcPr>
+            <w:tcW w:type="dxa" w:w="3168"/>
+            <w:shd w:fill="FFFFFF"/>
+            <w:tcMar>
+              <w:top w:w="80" w:type="dxa"/>
+              <w:bottom w:w="80" w:type="dxa"/>
+              <w:left w:w="120" w:type="dxa"/>
+              <w:right w:w="120" w:type="dxa"/>
+            </w:tcMar>
+          </w:tcPr>
+          <w:p>
+            <w:pPr>
+              <w:spacing w:before="40" w:after="40"/>
+              <w:jc w:val="left"/>
+            </w:pPr>
+            <w:r>
+              <w:rPr>
+                <w:rFonts w:ascii="Calibri" w:hAnsi="Calibri"/>
+                <w:color w:val="1E293B"/>
+                <w:sz w:val="18"/>
+              </w:rPr>
+              <w:t>T09E_VIEW_CUSTOMERS_AT_MOST_ONE_ROW_PER_CUSTOMER</w:t>
+            </w:r>
+          </w:p>
+        </w:tc>
+        <w:tc>
+          <w:tcPr>
+            <w:tcW w:type="dxa" w:w="1584"/>
+            <w:shd w:fill="FFFFFF"/>
+            <w:tcMar>
+              <w:top w:w="80" w:type="dxa"/>
+              <w:bottom w:w="80" w:type="dxa"/>
+              <w:left w:w="120" w:type="dxa"/>
+              <w:right w:w="120" w:type="dxa"/>
+            </w:tcMar>
+          </w:tcPr>
+          <w:p>
+            <w:pPr>
+              <w:spacing w:before="40" w:after="40"/>
+              <w:jc w:val="left"/>
+            </w:pPr>
+            <w:r>
+              <w:rPr>
+                <w:rFonts w:ascii="Calibri" w:hAnsi="Calibri"/>
+                <w:color w:val="1E293B"/>
+                <w:sz w:val="18"/>
+              </w:rPr>
+              <w:t>0 Duplicates</w:t>
+            </w:r>
+          </w:p>
+        </w:tc>
+        <w:tc>
+          <w:tcPr>
+            <w:tcW w:type="dxa" w:w="1584"/>
+            <w:shd w:fill="FFFFFF"/>
+            <w:tcMar>
+              <w:top w:w="80" w:type="dxa"/>
+              <w:bottom w:w="80" w:type="dxa"/>
+              <w:left w:w="120" w:type="dxa"/>
+              <w:right w:w="120" w:type="dxa"/>
+            </w:tcMar>
+          </w:tcPr>
+          <w:p>
+            <w:pPr>
+              <w:spacing w:before="40" w:after="40"/>
+              <w:jc w:val="left"/>
+            </w:pPr>
+            <w:r>
+              <w:rPr>
+                <w:rFonts w:ascii="Calibri" w:hAnsi="Calibri"/>
+                <w:color w:val="1E293B"/>
+                <w:sz w:val="18"/>
+              </w:rPr>
+              <w:t>0 Duplicates</w:t>
+            </w:r>
+          </w:p>
+        </w:tc>
+        <w:tc>
+          <w:tcPr>
+            <w:tcW w:type="dxa" w:w="1296"/>
+            <w:shd w:fill="FFFFFF"/>
+            <w:tcMar>
+              <w:top w:w="80" w:type="dxa"/>
+              <w:bottom w:w="80" w:type="dxa"/>
+              <w:left w:w="120" w:type="dxa"/>
+              <w:right w:w="120" w:type="dxa"/>
+            </w:tcMar>
+          </w:tcPr>
+          <w:p>
+            <w:pPr>
+              <w:spacing w:before="40" w:after="40"/>
+              <w:jc w:val="left"/>
+            </w:pPr>
+            <w:r>
+              <w:rPr>
+                <w:rFonts w:ascii="Calibri" w:hAnsi="Calibri"/>
+                <w:color w:val="1E293B"/>
+                <w:sz w:val="18"/>
+              </w:rPr>
+              <w:t>PASS</w:t>
+            </w:r>
+          </w:p>
+        </w:tc>
+        <w:tc>
+          <w:tcPr>
+            <w:tcW w:type="dxa" w:w="1728"/>
+            <w:shd w:fill="FFFFFF"/>
+            <w:tcMar>
+              <w:top w:w="80" w:type="dxa"/>
+              <w:bottom w:w="80" w:type="dxa"/>
+              <w:left w:w="120" w:type="dxa"/>
+              <w:right w:w="120" w:type="dxa"/>
+            </w:tcMar>
+          </w:tcPr>
+          <w:p>
+            <w:pPr>
+              <w:spacing w:before="40" w:after="40"/>
+              <w:jc w:val="left"/>
+            </w:pPr>
+            <w:r>
+              <w:rPr>
+                <w:rFonts w:ascii="Calibri" w:hAnsi="Calibri"/>
+                <w:color w:val="1E293B"/>
+                <w:sz w:val="18"/>
+              </w:rPr>
+              <w:t>Nominee Projection Uniqueness</w:t>
+            </w:r>
+          </w:p>
+        </w:tc>
+      </w:tr>
     </w:tbl>
     <w:p>
       <w:pPr>
@@ -12503,7 +12767,7 @@
       </w:pPr>
       <w:r>
         <w:br/>
-        <w:t>Summary of Validation Results: 35 assertions executed; 35 assertions PASSED; 0 FAILED. The financial ledger balance sum was conserved to the exact penny: ₹19,155,216.07 with zero unexplained variance. Application compatibility testing against disposable databases confirmed 16 out of 16 Next.js net-banking queries passed cleanly.</w:t>
+        <w:t>Summary of Validation Results: 37 assertions executed; 37 assertions PASSED; 0 FAILED. The financial ledger balance sum was conserved to the exact penny: ₹19,155,216.07 with zero unexplained variance. Application compatibility testing against disposable databases confirmed 27 out of 27 Next.js net-banking queries passed cleanly.</w:t>
       </w:r>
     </w:p>
     <w:p>
@@ -12536,7 +12800,7 @@
         <w:br/>
         <w:t xml:space="preserve">   • Creation of 'bankist_migration.sql' performing safe, lossless data migration from the original schema.</w:t>
         <w:br/>
-        <w:t xml:space="preserve">   • Creation of 'bankist_normalization_tests.sql' executing all 35 empirical assertions.</w:t>
+        <w:t xml:space="preserve">   • Creation of 'bankist_normalization_tests.sql' executing all 37 empirical assertions.</w:t>
         <w:br/>
         <w:t xml:space="preserve">   • Empirical proof of 100% test pass rate and ₹0.00 financial variance in disposable test environments.</w:t>
         <w:br/>
@@ -12605,7 +12869,7 @@
         <w:br/>
         <w:t xml:space="preserve">   node scripts/execute_normalization_validation.js</w:t>
         <w:br/>
-        <w:t xml:space="preserve">   Verify that all 35 assertions output [PASS] and that the live database remains untouched.</w:t>
+        <w:t xml:space="preserve">   Verify that all 37 assertions output [PASS] and that the live database remains untouched.</w:t>
         <w:br/>
         <w:br/>
         <w:t>Step 3: Safe Production Cutover (When Approved)</w:t>

</xml_diff>